<commit_message>
Update EJ 06.docx documentation
Revised the EJ 06.docx file with new or updated content. Refer to the document for specific changes.
</commit_message>
<xml_diff>
--- a/Documentación/EJ 06.docx
+++ b/Documentación/EJ 06.docx
@@ -3,35 +3,228 @@
 <w:document xmlns:wpc="http://schemas.microsoft.com/office/word/2010/wordprocessingCanvas" xmlns:cx="http://schemas.microsoft.com/office/drawing/2014/chartex" xmlns:cx1="http://schemas.microsoft.com/office/drawing/2015/9/8/chartex" xmlns:cx2="http://schemas.microsoft.com/office/drawing/2015/10/21/chartex" xmlns:cx3="http://schemas.microsoft.com/office/drawing/2016/5/9/chartex" xmlns:cx4="http://schemas.microsoft.com/office/drawing/2016/5/10/chartex" xmlns:cx5="http://schemas.microsoft.com/office/drawing/2016/5/11/chartex" xmlns:cx6="http://schemas.microsoft.com/office/drawing/2016/5/12/chartex" xmlns:cx7="http://schemas.microsoft.com/office/drawing/2016/5/13/chartex" xmlns:cx8="http://schemas.microsoft.com/office/drawing/2016/5/14/chartex" xmlns:mc="http://schemas.openxmlformats.org/markup-compatibility/2006" xmlns:aink="http://schemas.microsoft.com/office/drawing/2016/ink" xmlns:am3d="http://schemas.microsoft.com/office/drawing/2017/model3d" xmlns:o="urn:schemas-microsoft-com:office:office" xmlns:oel="http://schemas.microsoft.com/office/2019/extlst" xmlns:r="http://schemas.openxmlformats.org/officeDocument/2006/relationships" xmlns:m="http://schemas.openxmlformats.org/officeDocument/2006/math" xmlns:v="urn:schemas-microsoft-com:vml" xmlns:wp14="http://schemas.microsoft.com/office/word/2010/wordprocessingDrawing" xmlns:wp="http://schemas.openxmlformats.org/drawingml/2006/wordprocessingDrawing" xmlns:w10="urn:schemas-microsoft-com:office:word" xmlns:w="http://schemas.openxmlformats.org/wordprocessingml/2006/main" xmlns:w14="http://schemas.microsoft.com/office/word/2010/wordml" xmlns:w15="http://schemas.microsoft.com/office/word/2012/wordml" xmlns:w16cex="http://schemas.microsoft.com/office/word/2018/wordml/cex" xmlns:w16cid="http://schemas.microsoft.com/office/word/2016/wordml/cid" xmlns:w16="http://schemas.microsoft.com/office/word/2018/wordml" xmlns:w16du="http://schemas.microsoft.com/office/word/2023/wordml/word16du" xmlns:w16sdtdh="http://schemas.microsoft.com/office/word/2020/wordml/sdtdatahash" xmlns:w16sdtfl="http://schemas.microsoft.com/office/word/2024/wordml/sdtformatlock" xmlns:w16se="http://schemas.microsoft.com/office/word/2015/wordml/symex" xmlns:wpg="http://schemas.microsoft.com/office/word/2010/wordprocessingGroup" xmlns:wpi="http://schemas.microsoft.com/office/word/2010/wordprocessingInk" xmlns:wne="http://schemas.microsoft.com/office/word/2006/wordml" xmlns:wps="http://schemas.microsoft.com/office/word/2010/wordprocessingShape" mc:Ignorable="w14 w15 w16se w16cid w16 w16cex w16sdtdh w16sdtfl w16du wp14">
   <w:body>
     <w:p>
-      <w:r>
+      <w:pPr>
+        <w:rPr>
+          <w:b/>
+          <w:bCs/>
+        </w:rPr>
+      </w:pPr>
+      <w:r>
+        <w:rPr>
+          <w:b/>
+          <w:bCs/>
+        </w:rPr>
         <w:t>EJ 06 – PLANIFICACIÓN DE RECURSOS</w:t>
       </w:r>
     </w:p>
     <w:p>
-      <w:r>
-        <w:t>Resumen económico del proyecto</w:t>
-      </w:r>
-    </w:p>
-    <w:p>
-      <w:r>
-        <w:t>Proyecto: LA CREMALLERA – Sistema de gestión web para tienda de costura</w:t>
-      </w:r>
-    </w:p>
-    <w:p>
-      <w:r>
-        <w:pict w14:anchorId="5F112514">
-          <v:rect id="_x0000_i1073" style="width:0;height:1.5pt" o:hralign="center" o:hrstd="t" o:hr="t" fillcolor="#a0a0a0" stroked="f"/>
+      <w:pPr>
+        <w:rPr>
+          <w:b/>
+          <w:bCs/>
+        </w:rPr>
+      </w:pPr>
+      <w:r>
+        <w:rPr>
+          <w:b/>
+          <w:bCs/>
+        </w:rPr>
+        <w:t>Resumen económico del proyecto “La Cremallera”</w:t>
+      </w:r>
+    </w:p>
+    <w:p>
+      <w:pPr>
+        <w:rPr>
+          <w:b/>
+          <w:bCs/>
+        </w:rPr>
+      </w:pPr>
+      <w:r>
+        <w:rPr>
+          <w:b/>
+          <w:bCs/>
+        </w:rPr>
+        <w:t>1. Suposiciones iniciales</w:t>
+      </w:r>
+    </w:p>
+    <w:p>
+      <w:r>
+        <w:t>Para este ejercicio se parte de las siguientes premisas:</w:t>
+      </w:r>
+    </w:p>
+    <w:p>
+      <w:pPr>
+        <w:numPr>
+          <w:ilvl w:val="0"/>
+          <w:numId w:val="6"/>
+        </w:numPr>
+      </w:pPr>
+      <w:r>
+        <w:t xml:space="preserve">El proyecto es desarrollado por una </w:t>
+      </w:r>
+      <w:r>
+        <w:rPr>
+          <w:b/>
+          <w:bCs/>
+        </w:rPr>
+        <w:t>empresa de desarrollo de software</w:t>
+      </w:r>
+      <w:r>
+        <w:t xml:space="preserve"> creada desde cero.</w:t>
+      </w:r>
+    </w:p>
+    <w:p>
+      <w:pPr>
+        <w:numPr>
+          <w:ilvl w:val="0"/>
+          <w:numId w:val="6"/>
+        </w:numPr>
+      </w:pPr>
+      <w:r>
+        <w:t xml:space="preserve">La empresa </w:t>
+      </w:r>
+      <w:r>
+        <w:rPr>
+          <w:b/>
+          <w:bCs/>
+        </w:rPr>
+        <w:t>no dispone de recursos previos</w:t>
+      </w:r>
+      <w:r>
+        <w:t>: ni ordenadores, ni licencias, ni infraestructura.</w:t>
+      </w:r>
+    </w:p>
+    <w:p>
+      <w:pPr>
+        <w:numPr>
+          <w:ilvl w:val="0"/>
+          <w:numId w:val="6"/>
+        </w:numPr>
+      </w:pPr>
+      <w:r>
+        <w:t xml:space="preserve">El equipo está formado por </w:t>
+      </w:r>
+      <w:r>
+        <w:rPr>
+          <w:b/>
+          <w:bCs/>
+        </w:rPr>
+        <w:t>4 desarrolladores</w:t>
+      </w:r>
+      <w:r>
+        <w:t>.</w:t>
+      </w:r>
+    </w:p>
+    <w:p>
+      <w:pPr>
+        <w:numPr>
+          <w:ilvl w:val="0"/>
+          <w:numId w:val="6"/>
+        </w:numPr>
+      </w:pPr>
+      <w:r>
+        <w:t>La aplicación incluye:</w:t>
+      </w:r>
+    </w:p>
+    <w:p>
+      <w:pPr>
+        <w:numPr>
+          <w:ilvl w:val="1"/>
+          <w:numId w:val="6"/>
+        </w:numPr>
+      </w:pPr>
+      <w:proofErr w:type="spellStart"/>
+      <w:r>
+        <w:rPr>
+          <w:b/>
+          <w:bCs/>
+        </w:rPr>
+        <w:t>Backend</w:t>
+      </w:r>
+      <w:proofErr w:type="spellEnd"/>
+      <w:r>
+        <w:t>: API REST con Laravel y MySQL.</w:t>
+      </w:r>
+    </w:p>
+    <w:p>
+      <w:pPr>
+        <w:numPr>
+          <w:ilvl w:val="1"/>
+          <w:numId w:val="6"/>
+        </w:numPr>
+      </w:pPr>
+      <w:proofErr w:type="spellStart"/>
+      <w:r>
+        <w:rPr>
+          <w:b/>
+          <w:bCs/>
+        </w:rPr>
+        <w:t>Frontend</w:t>
+      </w:r>
+      <w:proofErr w:type="spellEnd"/>
+      <w:r>
+        <w:t xml:space="preserve">: aplicación web en </w:t>
+      </w:r>
+      <w:proofErr w:type="spellStart"/>
+      <w:r>
+        <w:t>React</w:t>
+      </w:r>
+      <w:proofErr w:type="spellEnd"/>
+      <w:r>
+        <w:t>, totalmente integrada con la API.</w:t>
+      </w:r>
+    </w:p>
+    <w:p>
+      <w:pPr>
+        <w:numPr>
+          <w:ilvl w:val="0"/>
+          <w:numId w:val="6"/>
+        </w:numPr>
+      </w:pPr>
+      <w:r>
+        <w:t>El proyecto se entrega completamente funcional, documentado y probado.</w:t>
+      </w:r>
+    </w:p>
+    <w:p>
+      <w:r>
+        <w:pict w14:anchorId="6077FE26">
+          <v:rect id="_x0000_i1041" style="width:0;height:1.5pt" o:hralign="center" o:hrstd="t" o:hr="t" fillcolor="#a0a0a0" stroked="f"/>
         </w:pict>
       </w:r>
     </w:p>
     <w:p>
-      <w:r>
-        <w:t>1. Consideraciones generales</w:t>
-      </w:r>
-    </w:p>
-    <w:p>
-      <w:r>
-        <w:t xml:space="preserve">El presente apartado recoge el resumen económico del desarrollo del proyecto La Cremallera, una aplicación web basada en una arquitectura cliente–servidor, donde el </w:t>
+      <w:pPr>
+        <w:rPr>
+          <w:b/>
+          <w:bCs/>
+        </w:rPr>
+      </w:pPr>
+      <w:r>
+        <w:rPr>
+          <w:b/>
+          <w:bCs/>
+        </w:rPr>
+        <w:t>2. Recursos materiales necesarios</w:t>
+      </w:r>
+    </w:p>
+    <w:p>
+      <w:pPr>
+        <w:rPr>
+          <w:b/>
+          <w:bCs/>
+        </w:rPr>
+      </w:pPr>
+      <w:r>
+        <w:rPr>
+          <w:b/>
+          <w:bCs/>
+        </w:rPr>
+        <w:t>2.1 Equipos informáticos</w:t>
+      </w:r>
+    </w:p>
+    <w:p>
+      <w:r>
+        <w:t>Cada integrante del equipo necesita un equipo de desarrollo adecuado para programación web moderna (</w:t>
       </w:r>
       <w:proofErr w:type="spellStart"/>
       <w:r>
@@ -39,7 +232,7 @@
       </w:r>
       <w:proofErr w:type="spellEnd"/>
       <w:r>
-        <w:t xml:space="preserve"> se implementa mediante una API REST y el </w:t>
+        <w:t xml:space="preserve"> + </w:t>
       </w:r>
       <w:proofErr w:type="spellStart"/>
       <w:r>
@@ -47,259 +240,72 @@
       </w:r>
       <w:proofErr w:type="spellEnd"/>
       <w:r>
-        <w:t xml:space="preserve"> se desarrolla en </w:t>
-      </w:r>
-      <w:proofErr w:type="spellStart"/>
-      <w:r>
-        <w:t>React</w:t>
-      </w:r>
-      <w:proofErr w:type="spellEnd"/>
-      <w:r>
-        <w:t>, consumiendo dicha API.</w:t>
-      </w:r>
-    </w:p>
-    <w:p>
-      <w:r>
-        <w:t>El proyecto se desarrolla en un entorno académico, por un equipo de cuatro integrantes, utilizando herramientas de software gratuitas o con licencia educativa, por lo que el principal coste del proyecto corresponde al factor humano.</w:t>
-      </w:r>
-    </w:p>
-    <w:p>
-      <w:r>
-        <w:pict w14:anchorId="2FC854F8">
-          <v:rect id="_x0000_i1074" style="width:0;height:1.5pt" o:hralign="center" o:hrstd="t" o:hr="t" fillcolor="#a0a0a0" stroked="f"/>
-        </w:pict>
-      </w:r>
-    </w:p>
-    <w:p>
-      <w:r>
-        <w:t>2. Recursos materiales</w:t>
-      </w:r>
-    </w:p>
-    <w:p>
-      <w:r>
-        <w:t>Cada integrante del equipo dispone de su propio equipamiento, necesario para el desarrollo del proyecto.</w:t>
-      </w:r>
-    </w:p>
-    <w:p>
-      <w:r>
-        <w:t>2.1 Equipamiento</w:t>
-      </w:r>
-    </w:p>
-    <w:p>
-      <w:r>
-        <w:t>4 ordenadores personales</w:t>
-      </w:r>
-    </w:p>
-    <w:p>
-      <w:r>
-        <w:t>Conexión a Internet</w:t>
-      </w:r>
-    </w:p>
-    <w:p>
-      <w:r>
-        <w:t>Periféricos básicos (teclado, ratón, monitor)</w:t>
-      </w:r>
-    </w:p>
-    <w:p>
-      <w:r>
-        <w:t>Al tratarse de recursos ya disponibles para los integrantes del equipo, no suponen un coste económico directo para el proyecto.</w:t>
-      </w:r>
-    </w:p>
-    <w:p>
-      <w:r>
-        <w:pict w14:anchorId="33708CBB">
-          <v:rect id="_x0000_i1075" style="width:0;height:1.5pt" o:hralign="center" o:hrstd="t" o:hr="t" fillcolor="#a0a0a0" stroked="f"/>
-        </w:pict>
-      </w:r>
-    </w:p>
-    <w:p>
-      <w:r>
-        <w:t>3. Recursos tecnológicos</w:t>
-      </w:r>
-    </w:p>
-    <w:p>
-      <w:r>
-        <w:t xml:space="preserve">Las herramientas y tecnologías utilizadas son de uso gratuito </w:t>
-      </w:r>
-      <w:proofErr w:type="spellStart"/>
-      <w:r>
-        <w:t>o</w:t>
-      </w:r>
-      <w:proofErr w:type="spellEnd"/>
-      <w:r>
-        <w:t xml:space="preserve"> open </w:t>
-      </w:r>
-      <w:proofErr w:type="spellStart"/>
-      <w:r>
-        <w:t>source</w:t>
-      </w:r>
-      <w:proofErr w:type="spellEnd"/>
-      <w:r>
-        <w:t>, por lo que no generan costes de licencias.</w:t>
-      </w:r>
-    </w:p>
-    <w:p>
-      <w:r>
-        <w:t>3.1 Software de desarrollo</w:t>
-      </w:r>
-    </w:p>
-    <w:p>
-      <w:r>
-        <w:t>Visual Studio Code</w:t>
-      </w:r>
-    </w:p>
-    <w:p>
-      <w:r>
-        <w:t>Git y GitHub</w:t>
-      </w:r>
-    </w:p>
-    <w:p>
-      <w:r>
-        <w:t>PHP 8.x</w:t>
-      </w:r>
-    </w:p>
-    <w:p>
-      <w:r>
-        <w:lastRenderedPageBreak/>
-        <w:t>Laravel</w:t>
-      </w:r>
-    </w:p>
-    <w:p>
-      <w:r>
-        <w:t xml:space="preserve">MySQL y MySQL </w:t>
-      </w:r>
-      <w:proofErr w:type="spellStart"/>
-      <w:r>
-        <w:t>Workbench</w:t>
-      </w:r>
-      <w:proofErr w:type="spellEnd"/>
-    </w:p>
-    <w:p>
-      <w:r>
-        <w:t>Node.js</w:t>
-      </w:r>
-    </w:p>
-    <w:p>
-      <w:proofErr w:type="spellStart"/>
-      <w:r>
-        <w:t>React</w:t>
-      </w:r>
-      <w:proofErr w:type="spellEnd"/>
-    </w:p>
-    <w:p>
-      <w:r>
-        <w:t>Postman</w:t>
-      </w:r>
-    </w:p>
-    <w:p>
-      <w:r>
-        <w:t>Navegadores web</w:t>
-      </w:r>
-    </w:p>
-    <w:p>
-      <w:r>
-        <w:t>Coste total de software: 0 €</w:t>
-      </w:r>
-    </w:p>
-    <w:p>
-      <w:r>
-        <w:pict w14:anchorId="7FD3A537">
-          <v:rect id="_x0000_i1076" style="width:0;height:1.5pt" o:hralign="center" o:hrstd="t" o:hr="t" fillcolor="#a0a0a0" stroked="f"/>
-        </w:pict>
-      </w:r>
-    </w:p>
-    <w:p>
-      <w:r>
-        <w:t>4. Coste de personal</w:t>
-      </w:r>
-    </w:p>
-    <w:p>
-      <w:r>
-        <w:t xml:space="preserve">El desarrollo del proyecto requiere la </w:t>
-      </w:r>
-      <w:proofErr w:type="gramStart"/>
-      <w:r>
-        <w:t>participación activa</w:t>
-      </w:r>
-      <w:proofErr w:type="gramEnd"/>
-      <w:r>
-        <w:t xml:space="preserve"> de los cuatro integrantes del equipo, que realizan tareas de análisis, diseño, desarrollo, pruebas y documentación.</w:t>
-      </w:r>
-    </w:p>
-    <w:p>
-      <w:r>
-        <w:t>4.1 Estimación de horas de trabajo</w:t>
-      </w:r>
-    </w:p>
-    <w:p>
-      <w:r>
-        <w:t>Se estima una dedicación aproximada de:</w:t>
-      </w:r>
-    </w:p>
-    <w:p>
-      <w:r>
-        <w:t>120 horas por integrante</w:t>
-      </w:r>
-    </w:p>
-    <w:p>
-      <w:proofErr w:type="gramStart"/>
-      <w:r>
-        <w:t>Total</w:t>
-      </w:r>
-      <w:proofErr w:type="gramEnd"/>
-      <w:r>
-        <w:t xml:space="preserve"> de horas del proyecto:</w:t>
-      </w:r>
-    </w:p>
-    <w:p>
-      <w:r>
-        <w:t>120 horas × 4 integrantes = 480 horas</w:t>
-      </w:r>
-    </w:p>
-    <w:p>
-      <w:r>
-        <w:pict w14:anchorId="75763387">
-          <v:rect id="_x0000_i1077" style="width:0;height:1.5pt" o:hralign="center" o:hrstd="t" o:hr="t" fillcolor="#a0a0a0" stroked="f"/>
-        </w:pict>
-      </w:r>
-    </w:p>
-    <w:p>
-      <w:r>
-        <w:t>4.2 Coste estimado por hora</w:t>
-      </w:r>
-    </w:p>
-    <w:p>
-      <w:r>
-        <w:t>Para el cálculo económico se toma como referencia un coste medio de 15 € por hora, valor habitual en estimaciones académicas de proyectos de desarrollo web.</w:t>
-      </w:r>
-    </w:p>
-    <w:p>
-      <w:r>
-        <w:pict w14:anchorId="52A3A852">
-          <v:rect id="_x0000_i1078" style="width:0;height:1.5pt" o:hralign="center" o:hrstd="t" o:hr="t" fillcolor="#a0a0a0" stroked="f"/>
-        </w:pict>
-      </w:r>
-    </w:p>
-    <w:p>
-      <w:r>
-        <w:t>4.3 Coste total de personal</w:t>
-      </w:r>
-    </w:p>
-    <w:p>
-      <w:r>
-        <w:t>480 horas × 15 €/hora = 7.200 €</w:t>
-      </w:r>
-    </w:p>
-    <w:p>
-      <w:r>
-        <w:pict w14:anchorId="6B7D2961">
-          <v:rect id="_x0000_i1079" style="width:0;height:1.5pt" o:hralign="center" o:hrstd="t" o:hr="t" fillcolor="#a0a0a0" stroked="f"/>
-        </w:pict>
-      </w:r>
-    </w:p>
-    <w:p>
-      <w:r>
-        <w:t>5. Resumen económico final</w:t>
+        <w:t>).</w:t>
+      </w:r>
+    </w:p>
+    <w:p>
+      <w:r>
+        <w:rPr>
+          <w:b/>
+          <w:bCs/>
+        </w:rPr>
+        <w:t>Características mínimas realistas:</w:t>
+      </w:r>
+    </w:p>
+    <w:p>
+      <w:pPr>
+        <w:numPr>
+          <w:ilvl w:val="0"/>
+          <w:numId w:val="7"/>
+        </w:numPr>
+      </w:pPr>
+      <w:r>
+        <w:t>Portátil de desarrollo profesional</w:t>
+      </w:r>
+    </w:p>
+    <w:p>
+      <w:pPr>
+        <w:numPr>
+          <w:ilvl w:val="0"/>
+          <w:numId w:val="7"/>
+        </w:numPr>
+      </w:pPr>
+      <w:r>
+        <w:t>Procesador gama media (i5 / Ryzen 5)</w:t>
+      </w:r>
+    </w:p>
+    <w:p>
+      <w:pPr>
+        <w:numPr>
+          <w:ilvl w:val="0"/>
+          <w:numId w:val="7"/>
+        </w:numPr>
+      </w:pPr>
+      <w:r>
+        <w:t>16 GB RAM</w:t>
+      </w:r>
+    </w:p>
+    <w:p>
+      <w:pPr>
+        <w:numPr>
+          <w:ilvl w:val="0"/>
+          <w:numId w:val="7"/>
+        </w:numPr>
+      </w:pPr>
+      <w:r>
+        <w:t>SSD 512 GB</w:t>
+      </w:r>
+    </w:p>
+    <w:p>
+      <w:r>
+        <w:rPr>
+          <w:b/>
+          <w:bCs/>
+        </w:rPr>
+        <w:t>Coste estimado por equipo:</w:t>
+      </w:r>
+      <w:r>
+        <w:t xml:space="preserve"> 1.200 €</w:t>
       </w:r>
     </w:p>
     <w:tbl>
@@ -315,8 +321,10 @@
         <w:tblLook w:val="04A0" w:firstRow="1" w:lastRow="0" w:firstColumn="1" w:lastColumn="0" w:noHBand="0" w:noVBand="1"/>
       </w:tblPr>
       <w:tblGrid>
-        <w:gridCol w:w="2197"/>
-        <w:gridCol w:w="834"/>
+        <w:gridCol w:w="1435"/>
+        <w:gridCol w:w="1065"/>
+        <w:gridCol w:w="1849"/>
+        <w:gridCol w:w="1620"/>
       </w:tblGrid>
       <w:tr>
         <w:trPr>
@@ -330,20 +338,98 @@
             <w:hideMark/>
           </w:tcPr>
           <w:p>
-            <w:r>
-              <w:t>Concepto</w:t>
-            </w:r>
-          </w:p>
-        </w:tc>
-        <w:tc>
-          <w:tcPr>
-            <w:tcW w:w="0" w:type="auto"/>
-            <w:vAlign w:val="center"/>
-            <w:hideMark/>
-          </w:tcPr>
-          <w:p>
-            <w:r>
-              <w:t>Coste</w:t>
+            <w:pPr>
+              <w:rPr>
+                <w:b/>
+                <w:bCs/>
+              </w:rPr>
+            </w:pPr>
+            <w:r>
+              <w:rPr>
+                <w:b/>
+                <w:bCs/>
+              </w:rPr>
+              <w:t>Recurso</w:t>
+            </w:r>
+          </w:p>
+        </w:tc>
+        <w:tc>
+          <w:tcPr>
+            <w:tcW w:w="0" w:type="auto"/>
+            <w:vAlign w:val="center"/>
+            <w:hideMark/>
+          </w:tcPr>
+          <w:p>
+            <w:pPr>
+              <w:rPr>
+                <w:b/>
+                <w:bCs/>
+              </w:rPr>
+            </w:pPr>
+            <w:r>
+              <w:rPr>
+                <w:b/>
+                <w:bCs/>
+              </w:rPr>
+              <w:t>Cantidad</w:t>
+            </w:r>
+          </w:p>
+        </w:tc>
+        <w:tc>
+          <w:tcPr>
+            <w:tcW w:w="0" w:type="auto"/>
+            <w:vAlign w:val="center"/>
+            <w:hideMark/>
+          </w:tcPr>
+          <w:p>
+            <w:pPr>
+              <w:rPr>
+                <w:b/>
+                <w:bCs/>
+              </w:rPr>
+            </w:pPr>
+            <w:r>
+              <w:rPr>
+                <w:b/>
+                <w:bCs/>
+              </w:rPr>
+              <w:t xml:space="preserve">     </w:t>
+            </w:r>
+            <w:r>
+              <w:rPr>
+                <w:b/>
+                <w:bCs/>
+              </w:rPr>
+              <w:t>Coste unitario</w:t>
+            </w:r>
+          </w:p>
+        </w:tc>
+        <w:tc>
+          <w:tcPr>
+            <w:tcW w:w="0" w:type="auto"/>
+            <w:vAlign w:val="center"/>
+            <w:hideMark/>
+          </w:tcPr>
+          <w:p>
+            <w:pPr>
+              <w:rPr>
+                <w:b/>
+                <w:bCs/>
+              </w:rPr>
+            </w:pPr>
+            <w:r>
+              <w:rPr>
+                <w:b/>
+                <w:bCs/>
+              </w:rPr>
+              <w:t xml:space="preserve">       </w:t>
+            </w:r>
+            <w:r>
+              <w:rPr>
+                <w:b/>
+                <w:bCs/>
+              </w:rPr>
+              <w:t>Coste total</w:t>
             </w:r>
           </w:p>
         </w:tc>
@@ -360,19 +446,147 @@
           </w:tcPr>
           <w:p>
             <w:r>
-              <w:t>Recursos materiales</w:t>
-            </w:r>
-          </w:p>
-        </w:tc>
-        <w:tc>
-          <w:tcPr>
-            <w:tcW w:w="0" w:type="auto"/>
-            <w:vAlign w:val="center"/>
-            <w:hideMark/>
-          </w:tcPr>
-          <w:p>
-            <w:r>
-              <w:t>0 €</w:t>
+              <w:t>Ordenadores</w:t>
+            </w:r>
+          </w:p>
+        </w:tc>
+        <w:tc>
+          <w:tcPr>
+            <w:tcW w:w="0" w:type="auto"/>
+            <w:vAlign w:val="center"/>
+            <w:hideMark/>
+          </w:tcPr>
+          <w:p>
+            <w:r>
+              <w:t xml:space="preserve">        </w:t>
+            </w:r>
+            <w:r>
+              <w:t>4</w:t>
+            </w:r>
+          </w:p>
+        </w:tc>
+        <w:tc>
+          <w:tcPr>
+            <w:tcW w:w="0" w:type="auto"/>
+            <w:vAlign w:val="center"/>
+            <w:hideMark/>
+          </w:tcPr>
+          <w:p>
+            <w:r>
+              <w:t xml:space="preserve">             </w:t>
+            </w:r>
+            <w:r>
+              <w:t>1.200 €</w:t>
+            </w:r>
+          </w:p>
+        </w:tc>
+        <w:tc>
+          <w:tcPr>
+            <w:tcW w:w="0" w:type="auto"/>
+            <w:vAlign w:val="center"/>
+            <w:hideMark/>
+          </w:tcPr>
+          <w:p>
+            <w:r>
+              <w:t xml:space="preserve">          </w:t>
+            </w:r>
+            <w:r>
+              <w:t>4.800 €</w:t>
+            </w:r>
+          </w:p>
+        </w:tc>
+      </w:tr>
+    </w:tbl>
+    <w:p>
+      <w:r>
+        <w:pict w14:anchorId="765DD9BC">
+          <v:rect id="_x0000_i1042" style="width:0;height:1.5pt" o:hralign="center" o:hrstd="t" o:hr="t" fillcolor="#a0a0a0" stroked="f"/>
+        </w:pict>
+      </w:r>
+    </w:p>
+    <w:p>
+      <w:pPr>
+        <w:rPr>
+          <w:b/>
+          <w:bCs/>
+        </w:rPr>
+      </w:pPr>
+      <w:r>
+        <w:rPr>
+          <w:b/>
+          <w:bCs/>
+        </w:rPr>
+        <w:t>2.2 Infraestructura y servicios</w:t>
+      </w:r>
+    </w:p>
+    <w:p>
+      <w:r>
+        <w:lastRenderedPageBreak/>
+        <w:t>Aunque el desarrollo sea local, una empresa necesita servicios básicos para el proyecto.</w:t>
+      </w:r>
+    </w:p>
+    <w:tbl>
+      <w:tblPr>
+        <w:tblW w:w="0" w:type="auto"/>
+        <w:tblCellSpacing w:w="15" w:type="dxa"/>
+        <w:tblCellMar>
+          <w:top w:w="15" w:type="dxa"/>
+          <w:left w:w="15" w:type="dxa"/>
+          <w:bottom w:w="15" w:type="dxa"/>
+          <w:right w:w="15" w:type="dxa"/>
+        </w:tblCellMar>
+        <w:tblLook w:val="04A0" w:firstRow="1" w:lastRow="0" w:firstColumn="1" w:lastColumn="0" w:noHBand="0" w:noVBand="1"/>
+      </w:tblPr>
+      <w:tblGrid>
+        <w:gridCol w:w="3847"/>
+        <w:gridCol w:w="1797"/>
+      </w:tblGrid>
+      <w:tr>
+        <w:trPr>
+          <w:tblHeader/>
+          <w:tblCellSpacing w:w="15" w:type="dxa"/>
+        </w:trPr>
+        <w:tc>
+          <w:tcPr>
+            <w:tcW w:w="0" w:type="auto"/>
+            <w:vAlign w:val="center"/>
+            <w:hideMark/>
+          </w:tcPr>
+          <w:p>
+            <w:pPr>
+              <w:rPr>
+                <w:b/>
+                <w:bCs/>
+              </w:rPr>
+            </w:pPr>
+            <w:r>
+              <w:rPr>
+                <w:b/>
+                <w:bCs/>
+              </w:rPr>
+              <w:t>Servicio</w:t>
+            </w:r>
+          </w:p>
+        </w:tc>
+        <w:tc>
+          <w:tcPr>
+            <w:tcW w:w="0" w:type="auto"/>
+            <w:vAlign w:val="center"/>
+            <w:hideMark/>
+          </w:tcPr>
+          <w:p>
+            <w:pPr>
+              <w:rPr>
+                <w:b/>
+                <w:bCs/>
+              </w:rPr>
+            </w:pPr>
+            <w:r>
+              <w:rPr>
+                <w:b/>
+                <w:bCs/>
+              </w:rPr>
+              <w:t>Coste estimado</w:t>
             </w:r>
           </w:p>
         </w:tc>
@@ -389,20 +603,19 @@
           </w:tcPr>
           <w:p>
             <w:r>
-              <w:lastRenderedPageBreak/>
-              <w:t>Software y licencias</w:t>
-            </w:r>
-          </w:p>
-        </w:tc>
-        <w:tc>
-          <w:tcPr>
-            <w:tcW w:w="0" w:type="auto"/>
-            <w:vAlign w:val="center"/>
-            <w:hideMark/>
-          </w:tcPr>
-          <w:p>
-            <w:r>
-              <w:t>0 €</w:t>
+              <w:t>Hosting / servidor pruebas (3 meses)</w:t>
+            </w:r>
+          </w:p>
+        </w:tc>
+        <w:tc>
+          <w:tcPr>
+            <w:tcW w:w="0" w:type="auto"/>
+            <w:vAlign w:val="center"/>
+            <w:hideMark/>
+          </w:tcPr>
+          <w:p>
+            <w:r>
+              <w:t>150 €</w:t>
             </w:r>
           </w:p>
         </w:tc>
@@ -419,19 +632,85 @@
           </w:tcPr>
           <w:p>
             <w:r>
-              <w:t>Coste de personal</w:t>
-            </w:r>
-          </w:p>
-        </w:tc>
-        <w:tc>
-          <w:tcPr>
-            <w:tcW w:w="0" w:type="auto"/>
-            <w:vAlign w:val="center"/>
-            <w:hideMark/>
-          </w:tcPr>
-          <w:p>
-            <w:r>
-              <w:t>7.200 €</w:t>
+              <w:t>Dominio web</w:t>
+            </w:r>
+          </w:p>
+        </w:tc>
+        <w:tc>
+          <w:tcPr>
+            <w:tcW w:w="0" w:type="auto"/>
+            <w:vAlign w:val="center"/>
+            <w:hideMark/>
+          </w:tcPr>
+          <w:p>
+            <w:r>
+              <w:t>15 €</w:t>
+            </w:r>
+          </w:p>
+        </w:tc>
+      </w:tr>
+      <w:tr>
+        <w:trPr>
+          <w:tblCellSpacing w:w="15" w:type="dxa"/>
+        </w:trPr>
+        <w:tc>
+          <w:tcPr>
+            <w:tcW w:w="0" w:type="auto"/>
+            <w:vAlign w:val="center"/>
+            <w:hideMark/>
+          </w:tcPr>
+          <w:p>
+            <w:r>
+              <w:t>Electricidad e internet (estimado)</w:t>
+            </w:r>
+          </w:p>
+        </w:tc>
+        <w:tc>
+          <w:tcPr>
+            <w:tcW w:w="0" w:type="auto"/>
+            <w:vAlign w:val="center"/>
+            <w:hideMark/>
+          </w:tcPr>
+          <w:p>
+            <w:r>
+              <w:t>300 €</w:t>
+            </w:r>
+          </w:p>
+        </w:tc>
+      </w:tr>
+      <w:tr>
+        <w:trPr>
+          <w:tblCellSpacing w:w="15" w:type="dxa"/>
+        </w:trPr>
+        <w:tc>
+          <w:tcPr>
+            <w:tcW w:w="0" w:type="auto"/>
+            <w:vAlign w:val="center"/>
+            <w:hideMark/>
+          </w:tcPr>
+          <w:p>
+            <w:r>
+              <w:rPr>
+                <w:b/>
+                <w:bCs/>
+              </w:rPr>
+              <w:t>Total, infraestructura</w:t>
+            </w:r>
+          </w:p>
+        </w:tc>
+        <w:tc>
+          <w:tcPr>
+            <w:tcW w:w="0" w:type="auto"/>
+            <w:vAlign w:val="center"/>
+            <w:hideMark/>
+          </w:tcPr>
+          <w:p>
+            <w:r>
+              <w:rPr>
+                <w:b/>
+                <w:bCs/>
+              </w:rPr>
+              <w:t>465 €</w:t>
             </w:r>
           </w:p>
         </w:tc>
@@ -439,26 +718,1176 @@
     </w:tbl>
     <w:p>
       <w:r>
-        <w:t>Coste total estimado del proyecto: 7.200 €</w:t>
-      </w:r>
-    </w:p>
-    <w:p>
-      <w:r>
-        <w:pict w14:anchorId="3BA9550A">
-          <v:rect id="_x0000_i1080" style="width:0;height:1.5pt" o:hralign="center" o:hrstd="t" o:hr="t" fillcolor="#a0a0a0" stroked="f"/>
+        <w:pict w14:anchorId="0976EAA6">
+          <v:rect id="_x0000_i1043" style="width:0;height:1.5pt" o:hralign="center" o:hrstd="t" o:hr="t" fillcolor="#a0a0a0" stroked="f"/>
         </w:pict>
       </w:r>
     </w:p>
     <w:p>
-      <w:r>
-        <w:t>6. Observaciones finales</w:t>
-      </w:r>
-    </w:p>
-    <w:p>
-      <w:r>
-        <w:t>El coste calculado representa una estimación teórica del valor del desarrollo del sistema. Al tratarse de un proyecto realizado en un contexto formativo, no existe un desembolso económico real, pero el cálculo permite dimensionar el esfuerzo y los recursos necesarios para un proyecto de estas características en un entorno profesional</w:t>
-      </w:r>
-    </w:p>
+      <w:pPr>
+        <w:rPr>
+          <w:b/>
+          <w:bCs/>
+        </w:rPr>
+      </w:pPr>
+      <w:r>
+        <w:rPr>
+          <w:b/>
+          <w:bCs/>
+        </w:rPr>
+        <w:t>2.3 Software y herramientas</w:t>
+      </w:r>
+    </w:p>
+    <w:p>
+      <w:r>
+        <w:t>Se prioriza el uso de herramientas estándar en el sector.</w:t>
+      </w:r>
+    </w:p>
+    <w:tbl>
+      <w:tblPr>
+        <w:tblW w:w="0" w:type="auto"/>
+        <w:tblCellSpacing w:w="15" w:type="dxa"/>
+        <w:tblCellMar>
+          <w:top w:w="15" w:type="dxa"/>
+          <w:left w:w="15" w:type="dxa"/>
+          <w:bottom w:w="15" w:type="dxa"/>
+          <w:right w:w="15" w:type="dxa"/>
+        </w:tblCellMar>
+        <w:tblLook w:val="04A0" w:firstRow="1" w:lastRow="0" w:firstColumn="1" w:lastColumn="0" w:noHBand="0" w:noVBand="1"/>
+      </w:tblPr>
+      <w:tblGrid>
+        <w:gridCol w:w="2044"/>
+        <w:gridCol w:w="1510"/>
+        <w:gridCol w:w="964"/>
+      </w:tblGrid>
+      <w:tr>
+        <w:trPr>
+          <w:tblHeader/>
+          <w:tblCellSpacing w:w="15" w:type="dxa"/>
+        </w:trPr>
+        <w:tc>
+          <w:tcPr>
+            <w:tcW w:w="0" w:type="auto"/>
+            <w:vAlign w:val="center"/>
+            <w:hideMark/>
+          </w:tcPr>
+          <w:p>
+            <w:pPr>
+              <w:rPr>
+                <w:b/>
+                <w:bCs/>
+              </w:rPr>
+            </w:pPr>
+            <w:r>
+              <w:rPr>
+                <w:b/>
+                <w:bCs/>
+              </w:rPr>
+              <w:t>Herramienta</w:t>
+            </w:r>
+          </w:p>
+        </w:tc>
+        <w:tc>
+          <w:tcPr>
+            <w:tcW w:w="0" w:type="auto"/>
+            <w:vAlign w:val="center"/>
+            <w:hideMark/>
+          </w:tcPr>
+          <w:p>
+            <w:pPr>
+              <w:rPr>
+                <w:b/>
+                <w:bCs/>
+              </w:rPr>
+            </w:pPr>
+            <w:r>
+              <w:rPr>
+                <w:b/>
+                <w:bCs/>
+              </w:rPr>
+              <w:t xml:space="preserve">     </w:t>
+            </w:r>
+            <w:r>
+              <w:rPr>
+                <w:b/>
+                <w:bCs/>
+              </w:rPr>
+              <w:t>Tipo</w:t>
+            </w:r>
+          </w:p>
+        </w:tc>
+        <w:tc>
+          <w:tcPr>
+            <w:tcW w:w="0" w:type="auto"/>
+            <w:vAlign w:val="center"/>
+            <w:hideMark/>
+          </w:tcPr>
+          <w:p>
+            <w:pPr>
+              <w:rPr>
+                <w:b/>
+                <w:bCs/>
+              </w:rPr>
+            </w:pPr>
+            <w:r>
+              <w:rPr>
+                <w:b/>
+                <w:bCs/>
+              </w:rPr>
+              <w:t xml:space="preserve">     </w:t>
+            </w:r>
+            <w:r>
+              <w:rPr>
+                <w:b/>
+                <w:bCs/>
+              </w:rPr>
+              <w:t>Coste</w:t>
+            </w:r>
+          </w:p>
+        </w:tc>
+      </w:tr>
+      <w:tr>
+        <w:trPr>
+          <w:tblCellSpacing w:w="15" w:type="dxa"/>
+        </w:trPr>
+        <w:tc>
+          <w:tcPr>
+            <w:tcW w:w="0" w:type="auto"/>
+            <w:vAlign w:val="center"/>
+            <w:hideMark/>
+          </w:tcPr>
+          <w:p>
+            <w:r>
+              <w:t>Visual Studio Code</w:t>
+            </w:r>
+          </w:p>
+        </w:tc>
+        <w:tc>
+          <w:tcPr>
+            <w:tcW w:w="0" w:type="auto"/>
+            <w:vAlign w:val="center"/>
+            <w:hideMark/>
+          </w:tcPr>
+          <w:p>
+            <w:r>
+              <w:t xml:space="preserve">  </w:t>
+            </w:r>
+            <w:r>
+              <w:t>Gratuito</w:t>
+            </w:r>
+          </w:p>
+        </w:tc>
+        <w:tc>
+          <w:tcPr>
+            <w:tcW w:w="0" w:type="auto"/>
+            <w:vAlign w:val="center"/>
+            <w:hideMark/>
+          </w:tcPr>
+          <w:p>
+            <w:r>
+              <w:t xml:space="preserve">       </w:t>
+            </w:r>
+            <w:r>
+              <w:t>0 €</w:t>
+            </w:r>
+          </w:p>
+        </w:tc>
+      </w:tr>
+      <w:tr>
+        <w:trPr>
+          <w:tblCellSpacing w:w="15" w:type="dxa"/>
+        </w:trPr>
+        <w:tc>
+          <w:tcPr>
+            <w:tcW w:w="0" w:type="auto"/>
+            <w:vAlign w:val="center"/>
+            <w:hideMark/>
+          </w:tcPr>
+          <w:p>
+            <w:r>
+              <w:t>GitHub</w:t>
+            </w:r>
+          </w:p>
+        </w:tc>
+        <w:tc>
+          <w:tcPr>
+            <w:tcW w:w="0" w:type="auto"/>
+            <w:vAlign w:val="center"/>
+            <w:hideMark/>
+          </w:tcPr>
+          <w:p>
+            <w:r>
+              <w:t xml:space="preserve">  </w:t>
+            </w:r>
+            <w:r>
+              <w:t>Gratuito</w:t>
+            </w:r>
+          </w:p>
+        </w:tc>
+        <w:tc>
+          <w:tcPr>
+            <w:tcW w:w="0" w:type="auto"/>
+            <w:vAlign w:val="center"/>
+            <w:hideMark/>
+          </w:tcPr>
+          <w:p>
+            <w:r>
+              <w:t xml:space="preserve">       </w:t>
+            </w:r>
+            <w:r>
+              <w:t>0 €</w:t>
+            </w:r>
+          </w:p>
+        </w:tc>
+      </w:tr>
+      <w:tr>
+        <w:trPr>
+          <w:tblCellSpacing w:w="15" w:type="dxa"/>
+        </w:trPr>
+        <w:tc>
+          <w:tcPr>
+            <w:tcW w:w="0" w:type="auto"/>
+            <w:vAlign w:val="center"/>
+            <w:hideMark/>
+          </w:tcPr>
+          <w:p>
+            <w:r>
+              <w:t xml:space="preserve">MySQL </w:t>
+            </w:r>
+            <w:proofErr w:type="spellStart"/>
+            <w:r>
+              <w:t>Workbench</w:t>
+            </w:r>
+            <w:proofErr w:type="spellEnd"/>
+          </w:p>
+        </w:tc>
+        <w:tc>
+          <w:tcPr>
+            <w:tcW w:w="0" w:type="auto"/>
+            <w:vAlign w:val="center"/>
+            <w:hideMark/>
+          </w:tcPr>
+          <w:p>
+            <w:r>
+              <w:t xml:space="preserve">  </w:t>
+            </w:r>
+            <w:r>
+              <w:t>Gratuito</w:t>
+            </w:r>
+          </w:p>
+        </w:tc>
+        <w:tc>
+          <w:tcPr>
+            <w:tcW w:w="0" w:type="auto"/>
+            <w:vAlign w:val="center"/>
+            <w:hideMark/>
+          </w:tcPr>
+          <w:p>
+            <w:r>
+              <w:t xml:space="preserve">       </w:t>
+            </w:r>
+            <w:r>
+              <w:t>0 €</w:t>
+            </w:r>
+          </w:p>
+        </w:tc>
+      </w:tr>
+      <w:tr>
+        <w:trPr>
+          <w:tblCellSpacing w:w="15" w:type="dxa"/>
+        </w:trPr>
+        <w:tc>
+          <w:tcPr>
+            <w:tcW w:w="0" w:type="auto"/>
+            <w:vAlign w:val="center"/>
+            <w:hideMark/>
+          </w:tcPr>
+          <w:p>
+            <w:r>
+              <w:t xml:space="preserve">Laravel / </w:t>
+            </w:r>
+            <w:proofErr w:type="spellStart"/>
+            <w:r>
+              <w:t>React</w:t>
+            </w:r>
+            <w:proofErr w:type="spellEnd"/>
+          </w:p>
+        </w:tc>
+        <w:tc>
+          <w:tcPr>
+            <w:tcW w:w="0" w:type="auto"/>
+            <w:vAlign w:val="center"/>
+            <w:hideMark/>
+          </w:tcPr>
+          <w:p>
+            <w:r>
+              <w:t xml:space="preserve">  </w:t>
+            </w:r>
+            <w:r>
+              <w:t xml:space="preserve">Open </w:t>
+            </w:r>
+            <w:proofErr w:type="spellStart"/>
+            <w:r>
+              <w:t>Source</w:t>
+            </w:r>
+            <w:proofErr w:type="spellEnd"/>
+          </w:p>
+        </w:tc>
+        <w:tc>
+          <w:tcPr>
+            <w:tcW w:w="0" w:type="auto"/>
+            <w:vAlign w:val="center"/>
+            <w:hideMark/>
+          </w:tcPr>
+          <w:p>
+            <w:r>
+              <w:t xml:space="preserve">       </w:t>
+            </w:r>
+            <w:r>
+              <w:t>0 €</w:t>
+            </w:r>
+          </w:p>
+        </w:tc>
+      </w:tr>
+      <w:tr>
+        <w:trPr>
+          <w:tblCellSpacing w:w="15" w:type="dxa"/>
+        </w:trPr>
+        <w:tc>
+          <w:tcPr>
+            <w:tcW w:w="0" w:type="auto"/>
+            <w:vAlign w:val="center"/>
+            <w:hideMark/>
+          </w:tcPr>
+          <w:p>
+            <w:r>
+              <w:t>Postman</w:t>
+            </w:r>
+          </w:p>
+        </w:tc>
+        <w:tc>
+          <w:tcPr>
+            <w:tcW w:w="0" w:type="auto"/>
+            <w:vAlign w:val="center"/>
+            <w:hideMark/>
+          </w:tcPr>
+          <w:p>
+            <w:r>
+              <w:t xml:space="preserve">   </w:t>
+            </w:r>
+            <w:r>
+              <w:t>Gratuito</w:t>
+            </w:r>
+          </w:p>
+        </w:tc>
+        <w:tc>
+          <w:tcPr>
+            <w:tcW w:w="0" w:type="auto"/>
+            <w:vAlign w:val="center"/>
+            <w:hideMark/>
+          </w:tcPr>
+          <w:p>
+            <w:r>
+              <w:t xml:space="preserve">       </w:t>
+            </w:r>
+            <w:r>
+              <w:t>0 €</w:t>
+            </w:r>
+          </w:p>
+        </w:tc>
+      </w:tr>
+    </w:tbl>
+    <w:p>
+      <w:r>
+        <w:rPr>
+          <w:b/>
+          <w:bCs/>
+        </w:rPr>
+        <w:t>Coste total software:</w:t>
+      </w:r>
+      <w:r>
+        <w:t xml:space="preserve"> </w:t>
+      </w:r>
+      <w:r>
+        <w:rPr>
+          <w:b/>
+          <w:bCs/>
+        </w:rPr>
+        <w:t>0 €</w:t>
+      </w:r>
+    </w:p>
+    <w:p>
+      <w:r>
+        <w:pict w14:anchorId="3214A4C4">
+          <v:rect id="_x0000_i1044" style="width:0;height:1.5pt" o:hralign="center" o:hrstd="t" o:hr="t" fillcolor="#a0a0a0" stroked="f"/>
+        </w:pict>
+      </w:r>
+    </w:p>
+    <w:p>
+      <w:pPr>
+        <w:rPr>
+          <w:b/>
+          <w:bCs/>
+        </w:rPr>
+      </w:pPr>
+      <w:r>
+        <w:rPr>
+          <w:b/>
+          <w:bCs/>
+        </w:rPr>
+        <w:t>3. Recursos humanos</w:t>
+      </w:r>
+    </w:p>
+    <w:p>
+      <w:pPr>
+        <w:rPr>
+          <w:b/>
+          <w:bCs/>
+        </w:rPr>
+      </w:pPr>
+      <w:r>
+        <w:rPr>
+          <w:b/>
+          <w:bCs/>
+        </w:rPr>
+        <w:t>3.1 Perfil del equipo</w:t>
+      </w:r>
+    </w:p>
+    <w:p>
+      <w:r>
+        <w:t xml:space="preserve">El equipo está formado por </w:t>
+      </w:r>
+      <w:r>
+        <w:rPr>
+          <w:b/>
+          <w:bCs/>
+        </w:rPr>
+        <w:t>4 desarrolladores junior</w:t>
+      </w:r>
+      <w:r>
+        <w:t>, trabajando como empleados de una empresa de desarrollo.</w:t>
+      </w:r>
+    </w:p>
+    <w:p>
+      <w:pPr>
+        <w:rPr>
+          <w:b/>
+          <w:bCs/>
+        </w:rPr>
+      </w:pPr>
+      <w:r>
+        <w:rPr>
+          <w:b/>
+          <w:bCs/>
+        </w:rPr>
+        <w:t>3.2 Tarifa profesional aplicada</w:t>
+      </w:r>
+    </w:p>
+    <w:p>
+      <w:r>
+        <w:t xml:space="preserve">Para proyectos empresariales de desarrollo web completo (API + </w:t>
+      </w:r>
+      <w:proofErr w:type="spellStart"/>
+      <w:r>
+        <w:t>Frontend</w:t>
+      </w:r>
+      <w:proofErr w:type="spellEnd"/>
+      <w:r>
+        <w:t xml:space="preserve">), las empresas suelen facturar entre </w:t>
+      </w:r>
+      <w:r>
+        <w:rPr>
+          <w:b/>
+          <w:bCs/>
+        </w:rPr>
+        <w:t>60 € y 100 € por hora</w:t>
+      </w:r>
+      <w:r>
+        <w:t>.</w:t>
+      </w:r>
+    </w:p>
+    <w:p>
+      <w:r>
+        <w:t xml:space="preserve">Para este proyecto se adopta una tarifa </w:t>
+      </w:r>
+      <w:r>
+        <w:rPr>
+          <w:b/>
+          <w:bCs/>
+        </w:rPr>
+        <w:t>realista y moderada</w:t>
+      </w:r>
+      <w:r>
+        <w:t xml:space="preserve"> de:</w:t>
+      </w:r>
+    </w:p>
+    <w:p>
+      <w:r>
+        <w:rPr>
+          <w:b/>
+          <w:bCs/>
+        </w:rPr>
+        <w:t>80 € / hora por desarrollador</w:t>
+      </w:r>
+    </w:p>
+    <w:p>
+      <w:r>
+        <w:lastRenderedPageBreak/>
+        <w:t>Esta tarifa incluye:</w:t>
+      </w:r>
+    </w:p>
+    <w:p>
+      <w:pPr>
+        <w:numPr>
+          <w:ilvl w:val="0"/>
+          <w:numId w:val="8"/>
+        </w:numPr>
+      </w:pPr>
+      <w:r>
+        <w:t>Desarrollo</w:t>
+      </w:r>
+    </w:p>
+    <w:p>
+      <w:pPr>
+        <w:numPr>
+          <w:ilvl w:val="0"/>
+          <w:numId w:val="8"/>
+        </w:numPr>
+      </w:pPr>
+      <w:r>
+        <w:t>Pruebas</w:t>
+      </w:r>
+    </w:p>
+    <w:p>
+      <w:pPr>
+        <w:numPr>
+          <w:ilvl w:val="0"/>
+          <w:numId w:val="8"/>
+        </w:numPr>
+      </w:pPr>
+      <w:r>
+        <w:t>Documentación</w:t>
+      </w:r>
+    </w:p>
+    <w:p>
+      <w:pPr>
+        <w:numPr>
+          <w:ilvl w:val="0"/>
+          <w:numId w:val="8"/>
+        </w:numPr>
+      </w:pPr>
+      <w:r>
+        <w:t>Coordinación técnica</w:t>
+      </w:r>
+    </w:p>
+    <w:p>
+      <w:pPr>
+        <w:numPr>
+          <w:ilvl w:val="0"/>
+          <w:numId w:val="8"/>
+        </w:numPr>
+      </w:pPr>
+      <w:r>
+        <w:t>Responsabilidad profesional</w:t>
+      </w:r>
+    </w:p>
+    <w:p>
+      <w:r>
+        <w:pict w14:anchorId="5D01D176">
+          <v:rect id="_x0000_i1045" style="width:0;height:1.5pt" o:hralign="center" o:hrstd="t" o:hr="t" fillcolor="#a0a0a0" stroked="f"/>
+        </w:pict>
+      </w:r>
+    </w:p>
+    <w:p>
+      <w:pPr>
+        <w:rPr>
+          <w:b/>
+          <w:bCs/>
+        </w:rPr>
+      </w:pPr>
+      <w:r>
+        <w:rPr>
+          <w:b/>
+          <w:bCs/>
+        </w:rPr>
+        <w:t>3.3 Estimación de horas de desarrollo</w:t>
+      </w:r>
+    </w:p>
+    <w:p>
+      <w:r>
+        <w:t xml:space="preserve">Proyecto completo con </w:t>
+      </w:r>
+      <w:proofErr w:type="spellStart"/>
+      <w:r>
+        <w:t>backend</w:t>
+      </w:r>
+      <w:proofErr w:type="spellEnd"/>
+      <w:r>
+        <w:t xml:space="preserve">, </w:t>
+      </w:r>
+      <w:proofErr w:type="spellStart"/>
+      <w:r>
+        <w:t>frontend</w:t>
+      </w:r>
+      <w:proofErr w:type="spellEnd"/>
+      <w:r>
+        <w:t xml:space="preserve"> </w:t>
+      </w:r>
+      <w:proofErr w:type="spellStart"/>
+      <w:r>
+        <w:t>React</w:t>
+      </w:r>
+      <w:proofErr w:type="spellEnd"/>
+      <w:r>
+        <w:t xml:space="preserve"> e integración:</w:t>
+      </w:r>
+    </w:p>
+    <w:p>
+      <w:pPr>
+        <w:numPr>
+          <w:ilvl w:val="0"/>
+          <w:numId w:val="9"/>
+        </w:numPr>
+      </w:pPr>
+      <w:r>
+        <w:t xml:space="preserve">Horas totales estimadas del proyecto: </w:t>
+      </w:r>
+      <w:r>
+        <w:rPr>
+          <w:b/>
+          <w:bCs/>
+        </w:rPr>
+        <w:t>480 horas</w:t>
+      </w:r>
+    </w:p>
+    <w:p>
+      <w:r>
+        <w:t>(Equivalente a un proyecto de tamaño medio desarrollado por un equipo pequeño)</w:t>
+      </w:r>
+    </w:p>
+    <w:p>
+      <w:r>
+        <w:pict w14:anchorId="29CD890A">
+          <v:rect id="_x0000_i1046" style="width:0;height:1.5pt" o:hralign="center" o:hrstd="t" o:hr="t" fillcolor="#a0a0a0" stroked="f"/>
+        </w:pict>
+      </w:r>
+    </w:p>
+    <w:p>
+      <w:pPr>
+        <w:rPr>
+          <w:b/>
+          <w:bCs/>
+        </w:rPr>
+      </w:pPr>
+      <w:r>
+        <w:rPr>
+          <w:b/>
+          <w:bCs/>
+        </w:rPr>
+        <w:t>3.4 Coste de desarrollo</w:t>
+      </w:r>
+    </w:p>
+    <w:tbl>
+      <w:tblPr>
+        <w:tblW w:w="0" w:type="auto"/>
+        <w:tblCellSpacing w:w="15" w:type="dxa"/>
+        <w:tblCellMar>
+          <w:top w:w="15" w:type="dxa"/>
+          <w:left w:w="15" w:type="dxa"/>
+          <w:bottom w:w="15" w:type="dxa"/>
+          <w:right w:w="15" w:type="dxa"/>
+        </w:tblCellMar>
+        <w:tblLook w:val="04A0" w:firstRow="1" w:lastRow="0" w:firstColumn="1" w:lastColumn="0" w:noHBand="0" w:noVBand="1"/>
+      </w:tblPr>
+      <w:tblGrid>
+        <w:gridCol w:w="2893"/>
+        <w:gridCol w:w="1209"/>
+      </w:tblGrid>
+      <w:tr>
+        <w:trPr>
+          <w:tblHeader/>
+          <w:tblCellSpacing w:w="15" w:type="dxa"/>
+        </w:trPr>
+        <w:tc>
+          <w:tcPr>
+            <w:tcW w:w="0" w:type="auto"/>
+            <w:vAlign w:val="center"/>
+            <w:hideMark/>
+          </w:tcPr>
+          <w:p>
+            <w:pPr>
+              <w:rPr>
+                <w:b/>
+                <w:bCs/>
+              </w:rPr>
+            </w:pPr>
+            <w:r>
+              <w:rPr>
+                <w:b/>
+                <w:bCs/>
+              </w:rPr>
+              <w:t>Concepto</w:t>
+            </w:r>
+          </w:p>
+        </w:tc>
+        <w:tc>
+          <w:tcPr>
+            <w:tcW w:w="0" w:type="auto"/>
+            <w:vAlign w:val="center"/>
+            <w:hideMark/>
+          </w:tcPr>
+          <w:p>
+            <w:pPr>
+              <w:rPr>
+                <w:b/>
+                <w:bCs/>
+              </w:rPr>
+            </w:pPr>
+            <w:r>
+              <w:rPr>
+                <w:b/>
+                <w:bCs/>
+              </w:rPr>
+              <w:t xml:space="preserve">      </w:t>
+            </w:r>
+            <w:r>
+              <w:rPr>
+                <w:b/>
+                <w:bCs/>
+              </w:rPr>
+              <w:t>Valor</w:t>
+            </w:r>
+          </w:p>
+        </w:tc>
+      </w:tr>
+      <w:tr>
+        <w:trPr>
+          <w:tblCellSpacing w:w="15" w:type="dxa"/>
+        </w:trPr>
+        <w:tc>
+          <w:tcPr>
+            <w:tcW w:w="0" w:type="auto"/>
+            <w:vAlign w:val="center"/>
+            <w:hideMark/>
+          </w:tcPr>
+          <w:p>
+            <w:r>
+              <w:t>Horas totales</w:t>
+            </w:r>
+          </w:p>
+        </w:tc>
+        <w:tc>
+          <w:tcPr>
+            <w:tcW w:w="0" w:type="auto"/>
+            <w:vAlign w:val="center"/>
+            <w:hideMark/>
+          </w:tcPr>
+          <w:p>
+            <w:r>
+              <w:t xml:space="preserve">      </w:t>
+            </w:r>
+            <w:r>
+              <w:t>480 h</w:t>
+            </w:r>
+          </w:p>
+        </w:tc>
+      </w:tr>
+      <w:tr>
+        <w:trPr>
+          <w:tblCellSpacing w:w="15" w:type="dxa"/>
+        </w:trPr>
+        <w:tc>
+          <w:tcPr>
+            <w:tcW w:w="0" w:type="auto"/>
+            <w:vAlign w:val="center"/>
+            <w:hideMark/>
+          </w:tcPr>
+          <w:p>
+            <w:r>
+              <w:t>Tarifa por hora</w:t>
+            </w:r>
+          </w:p>
+        </w:tc>
+        <w:tc>
+          <w:tcPr>
+            <w:tcW w:w="0" w:type="auto"/>
+            <w:vAlign w:val="center"/>
+            <w:hideMark/>
+          </w:tcPr>
+          <w:p>
+            <w:r>
+              <w:t xml:space="preserve">       </w:t>
+            </w:r>
+            <w:r>
+              <w:t>80 €</w:t>
+            </w:r>
+          </w:p>
+        </w:tc>
+      </w:tr>
+      <w:tr>
+        <w:trPr>
+          <w:tblCellSpacing w:w="15" w:type="dxa"/>
+        </w:trPr>
+        <w:tc>
+          <w:tcPr>
+            <w:tcW w:w="0" w:type="auto"/>
+            <w:vAlign w:val="center"/>
+            <w:hideMark/>
+          </w:tcPr>
+          <w:p>
+            <w:r>
+              <w:rPr>
+                <w:b/>
+                <w:bCs/>
+              </w:rPr>
+              <w:t>Coste desarrollo software</w:t>
+            </w:r>
+          </w:p>
+        </w:tc>
+        <w:tc>
+          <w:tcPr>
+            <w:tcW w:w="0" w:type="auto"/>
+            <w:vAlign w:val="center"/>
+            <w:hideMark/>
+          </w:tcPr>
+          <w:p>
+            <w:r>
+              <w:rPr>
+                <w:b/>
+                <w:bCs/>
+              </w:rPr>
+              <w:t xml:space="preserve">     </w:t>
+            </w:r>
+            <w:r>
+              <w:rPr>
+                <w:b/>
+                <w:bCs/>
+              </w:rPr>
+              <w:t>38.400 €</w:t>
+            </w:r>
+          </w:p>
+        </w:tc>
+      </w:tr>
+    </w:tbl>
+    <w:p>
+      <w:r>
+        <w:pict w14:anchorId="4D0F110F">
+          <v:rect id="_x0000_i1047" style="width:0;height:1.5pt" o:hralign="center" o:hrstd="t" o:hr="t" fillcolor="#a0a0a0" stroked="f"/>
+        </w:pict>
+      </w:r>
+    </w:p>
+    <w:p>
+      <w:pPr>
+        <w:rPr>
+          <w:b/>
+          <w:bCs/>
+        </w:rPr>
+      </w:pPr>
+      <w:r>
+        <w:rPr>
+          <w:b/>
+          <w:bCs/>
+        </w:rPr>
+        <w:t>4. Resumen económico global</w:t>
+      </w:r>
+    </w:p>
+    <w:p>
+      <w:pPr>
+        <w:rPr>
+          <w:b/>
+          <w:bCs/>
+        </w:rPr>
+      </w:pPr>
+      <w:r>
+        <w:rPr>
+          <w:b/>
+          <w:bCs/>
+        </w:rPr>
+        <w:t>4.1 Costes directos</w:t>
+      </w:r>
+    </w:p>
+    <w:tbl>
+      <w:tblPr>
+        <w:tblW w:w="0" w:type="auto"/>
+        <w:tblCellSpacing w:w="15" w:type="dxa"/>
+        <w:tblCellMar>
+          <w:top w:w="15" w:type="dxa"/>
+          <w:left w:w="15" w:type="dxa"/>
+          <w:bottom w:w="15" w:type="dxa"/>
+          <w:right w:w="15" w:type="dxa"/>
+        </w:tblCellMar>
+        <w:tblLook w:val="04A0" w:firstRow="1" w:lastRow="0" w:firstColumn="1" w:lastColumn="0" w:noHBand="0" w:noVBand="1"/>
+      </w:tblPr>
+      <w:tblGrid>
+        <w:gridCol w:w="2765"/>
+        <w:gridCol w:w="1645"/>
+      </w:tblGrid>
+      <w:tr>
+        <w:trPr>
+          <w:tblHeader/>
+          <w:tblCellSpacing w:w="15" w:type="dxa"/>
+        </w:trPr>
+        <w:tc>
+          <w:tcPr>
+            <w:tcW w:w="0" w:type="auto"/>
+            <w:vAlign w:val="center"/>
+            <w:hideMark/>
+          </w:tcPr>
+          <w:p>
+            <w:pPr>
+              <w:rPr>
+                <w:b/>
+                <w:bCs/>
+              </w:rPr>
+            </w:pPr>
+            <w:r>
+              <w:rPr>
+                <w:b/>
+                <w:bCs/>
+              </w:rPr>
+              <w:t>Concepto</w:t>
+            </w:r>
+          </w:p>
+        </w:tc>
+        <w:tc>
+          <w:tcPr>
+            <w:tcW w:w="0" w:type="auto"/>
+            <w:vAlign w:val="center"/>
+            <w:hideMark/>
+          </w:tcPr>
+          <w:p>
+            <w:pPr>
+              <w:rPr>
+                <w:b/>
+                <w:bCs/>
+              </w:rPr>
+            </w:pPr>
+            <w:r>
+              <w:rPr>
+                <w:b/>
+                <w:bCs/>
+              </w:rPr>
+              <w:t xml:space="preserve">              </w:t>
+            </w:r>
+            <w:r>
+              <w:rPr>
+                <w:b/>
+                <w:bCs/>
+              </w:rPr>
+              <w:t>Coste</w:t>
+            </w:r>
+          </w:p>
+        </w:tc>
+      </w:tr>
+      <w:tr>
+        <w:trPr>
+          <w:tblCellSpacing w:w="15" w:type="dxa"/>
+        </w:trPr>
+        <w:tc>
+          <w:tcPr>
+            <w:tcW w:w="0" w:type="auto"/>
+            <w:vAlign w:val="center"/>
+            <w:hideMark/>
+          </w:tcPr>
+          <w:p>
+            <w:r>
+              <w:t>Equipos informáticos</w:t>
+            </w:r>
+          </w:p>
+        </w:tc>
+        <w:tc>
+          <w:tcPr>
+            <w:tcW w:w="0" w:type="auto"/>
+            <w:vAlign w:val="center"/>
+            <w:hideMark/>
+          </w:tcPr>
+          <w:p>
+            <w:r>
+              <w:t xml:space="preserve">             </w:t>
+            </w:r>
+            <w:r>
+              <w:t>4.800 €</w:t>
+            </w:r>
+          </w:p>
+        </w:tc>
+      </w:tr>
+      <w:tr>
+        <w:trPr>
+          <w:tblCellSpacing w:w="15" w:type="dxa"/>
+        </w:trPr>
+        <w:tc>
+          <w:tcPr>
+            <w:tcW w:w="0" w:type="auto"/>
+            <w:vAlign w:val="center"/>
+            <w:hideMark/>
+          </w:tcPr>
+          <w:p>
+            <w:r>
+              <w:t>Infraestructura y servicios</w:t>
+            </w:r>
+          </w:p>
+        </w:tc>
+        <w:tc>
+          <w:tcPr>
+            <w:tcW w:w="0" w:type="auto"/>
+            <w:vAlign w:val="center"/>
+            <w:hideMark/>
+          </w:tcPr>
+          <w:p>
+            <w:r>
+              <w:t xml:space="preserve">               </w:t>
+            </w:r>
+            <w:r>
+              <w:t>465 €</w:t>
+            </w:r>
+          </w:p>
+        </w:tc>
+      </w:tr>
+      <w:tr>
+        <w:trPr>
+          <w:tblCellSpacing w:w="15" w:type="dxa"/>
+        </w:trPr>
+        <w:tc>
+          <w:tcPr>
+            <w:tcW w:w="0" w:type="auto"/>
+            <w:vAlign w:val="center"/>
+            <w:hideMark/>
+          </w:tcPr>
+          <w:p>
+            <w:r>
+              <w:t>Software</w:t>
+            </w:r>
+          </w:p>
+        </w:tc>
+        <w:tc>
+          <w:tcPr>
+            <w:tcW w:w="0" w:type="auto"/>
+            <w:vAlign w:val="center"/>
+            <w:hideMark/>
+          </w:tcPr>
+          <w:p>
+            <w:r>
+              <w:t xml:space="preserve">                  </w:t>
+            </w:r>
+            <w:r>
+              <w:t>0 €</w:t>
+            </w:r>
+          </w:p>
+        </w:tc>
+      </w:tr>
+      <w:tr>
+        <w:trPr>
+          <w:tblCellSpacing w:w="15" w:type="dxa"/>
+        </w:trPr>
+        <w:tc>
+          <w:tcPr>
+            <w:tcW w:w="0" w:type="auto"/>
+            <w:vAlign w:val="center"/>
+            <w:hideMark/>
+          </w:tcPr>
+          <w:p>
+            <w:r>
+              <w:t>Desarrollo (mano de obra)</w:t>
+            </w:r>
+          </w:p>
+        </w:tc>
+        <w:tc>
+          <w:tcPr>
+            <w:tcW w:w="0" w:type="auto"/>
+            <w:vAlign w:val="center"/>
+            <w:hideMark/>
+          </w:tcPr>
+          <w:p>
+            <w:r>
+              <w:t xml:space="preserve">              </w:t>
+            </w:r>
+            <w:r>
+              <w:t>38.400 €</w:t>
+            </w:r>
+          </w:p>
+        </w:tc>
+      </w:tr>
+    </w:tbl>
+    <w:p>
+      <w:r>
+        <w:pict w14:anchorId="560E50C7">
+          <v:rect id="_x0000_i1048" style="width:0;height:1.5pt" o:hralign="center" o:hrstd="t" o:hr="t" fillcolor="#a0a0a0" stroked="f"/>
+        </w:pict>
+      </w:r>
+    </w:p>
+    <w:p>
+      <w:pPr>
+        <w:rPr>
+          <w:b/>
+          <w:bCs/>
+        </w:rPr>
+      </w:pPr>
+      <w:r>
+        <w:rPr>
+          <w:b/>
+          <w:bCs/>
+        </w:rPr>
+        <w:t>4.2 Coste total del proyecto</w:t>
+      </w:r>
+    </w:p>
+    <w:p>
+      <w:r>
+        <w:rPr>
+          <w:b/>
+          <w:bCs/>
+        </w:rPr>
+        <w:lastRenderedPageBreak/>
+        <w:t>Coste total estimado del proyecto: 43.665 €</w:t>
+      </w:r>
+    </w:p>
+    <w:p>
+      <w:r>
+        <w:pict w14:anchorId="7E3DC472">
+          <v:rect id="_x0000_i1049" style="width:0;height:1.5pt" o:hralign="center" o:hrstd="t" o:hr="t" fillcolor="#a0a0a0" stroked="f"/>
+        </w:pict>
+      </w:r>
+    </w:p>
+    <w:p>
+      <w:pPr>
+        <w:rPr>
+          <w:b/>
+          <w:bCs/>
+        </w:rPr>
+      </w:pPr>
+      <w:r>
+        <w:rPr>
+          <w:b/>
+          <w:bCs/>
+        </w:rPr>
+        <w:t>5. Conclusión económica (enfoque empresarial)</w:t>
+      </w:r>
+    </w:p>
+    <w:p>
+      <w:r>
+        <w:t xml:space="preserve">Desde un punto de vista empresarial, el desarrollo de la aplicación </w:t>
+      </w:r>
+      <w:r>
+        <w:rPr>
+          <w:b/>
+          <w:bCs/>
+        </w:rPr>
+        <w:t>La Cremallera</w:t>
+      </w:r>
+      <w:r>
+        <w:t xml:space="preserve"> supone una inversión cercana a los </w:t>
+      </w:r>
+      <w:r>
+        <w:rPr>
+          <w:b/>
+          <w:bCs/>
+        </w:rPr>
+        <w:t>44.000 €</w:t>
+      </w:r>
+      <w:r>
+        <w:t>, teniendo en cuenta que la empresa parte desde cero y debe adquirir tanto recursos materiales como humanos.</w:t>
+      </w:r>
+    </w:p>
+    <w:p/>
     <w:p/>
     <w:sectPr>
       <w:pgSz w:w="11906" w:h="16838"/>
@@ -622,6 +2051,453 @@
     </w:lvl>
   </w:abstractNum>
   <w:abstractNum w:abstractNumId="1" w15:restartNumberingAfterBreak="0">
+    <w:nsid w:val="2C3533C8"/>
+    <w:multiLevelType w:val="multilevel"/>
+    <w:tmpl w:val="75E67840"/>
+    <w:lvl w:ilvl="0">
+      <w:start w:val="1"/>
+      <w:numFmt w:val="bullet"/>
+      <w:lvlText w:val=""/>
+      <w:lvlJc w:val="left"/>
+      <w:pPr>
+        <w:tabs>
+          <w:tab w:val="num" w:pos="720"/>
+        </w:tabs>
+        <w:ind w:left="720" w:hanging="360"/>
+      </w:pPr>
+      <w:rPr>
+        <w:rFonts w:ascii="Symbol" w:hAnsi="Symbol" w:hint="default"/>
+        <w:sz w:val="20"/>
+      </w:rPr>
+    </w:lvl>
+    <w:lvl w:ilvl="1" w:tentative="1">
+      <w:start w:val="1"/>
+      <w:numFmt w:val="bullet"/>
+      <w:lvlText w:val="o"/>
+      <w:lvlJc w:val="left"/>
+      <w:pPr>
+        <w:tabs>
+          <w:tab w:val="num" w:pos="1440"/>
+        </w:tabs>
+        <w:ind w:left="1440" w:hanging="360"/>
+      </w:pPr>
+      <w:rPr>
+        <w:rFonts w:ascii="Courier New" w:hAnsi="Courier New" w:hint="default"/>
+        <w:sz w:val="20"/>
+      </w:rPr>
+    </w:lvl>
+    <w:lvl w:ilvl="2" w:tentative="1">
+      <w:start w:val="1"/>
+      <w:numFmt w:val="bullet"/>
+      <w:lvlText w:val=""/>
+      <w:lvlJc w:val="left"/>
+      <w:pPr>
+        <w:tabs>
+          <w:tab w:val="num" w:pos="2160"/>
+        </w:tabs>
+        <w:ind w:left="2160" w:hanging="360"/>
+      </w:pPr>
+      <w:rPr>
+        <w:rFonts w:ascii="Wingdings" w:hAnsi="Wingdings" w:hint="default"/>
+        <w:sz w:val="20"/>
+      </w:rPr>
+    </w:lvl>
+    <w:lvl w:ilvl="3" w:tentative="1">
+      <w:start w:val="1"/>
+      <w:numFmt w:val="bullet"/>
+      <w:lvlText w:val=""/>
+      <w:lvlJc w:val="left"/>
+      <w:pPr>
+        <w:tabs>
+          <w:tab w:val="num" w:pos="2880"/>
+        </w:tabs>
+        <w:ind w:left="2880" w:hanging="360"/>
+      </w:pPr>
+      <w:rPr>
+        <w:rFonts w:ascii="Wingdings" w:hAnsi="Wingdings" w:hint="default"/>
+        <w:sz w:val="20"/>
+      </w:rPr>
+    </w:lvl>
+    <w:lvl w:ilvl="4" w:tentative="1">
+      <w:start w:val="1"/>
+      <w:numFmt w:val="bullet"/>
+      <w:lvlText w:val=""/>
+      <w:lvlJc w:val="left"/>
+      <w:pPr>
+        <w:tabs>
+          <w:tab w:val="num" w:pos="3600"/>
+        </w:tabs>
+        <w:ind w:left="3600" w:hanging="360"/>
+      </w:pPr>
+      <w:rPr>
+        <w:rFonts w:ascii="Wingdings" w:hAnsi="Wingdings" w:hint="default"/>
+        <w:sz w:val="20"/>
+      </w:rPr>
+    </w:lvl>
+    <w:lvl w:ilvl="5" w:tentative="1">
+      <w:start w:val="1"/>
+      <w:numFmt w:val="bullet"/>
+      <w:lvlText w:val=""/>
+      <w:lvlJc w:val="left"/>
+      <w:pPr>
+        <w:tabs>
+          <w:tab w:val="num" w:pos="4320"/>
+        </w:tabs>
+        <w:ind w:left="4320" w:hanging="360"/>
+      </w:pPr>
+      <w:rPr>
+        <w:rFonts w:ascii="Wingdings" w:hAnsi="Wingdings" w:hint="default"/>
+        <w:sz w:val="20"/>
+      </w:rPr>
+    </w:lvl>
+    <w:lvl w:ilvl="6" w:tentative="1">
+      <w:start w:val="1"/>
+      <w:numFmt w:val="bullet"/>
+      <w:lvlText w:val=""/>
+      <w:lvlJc w:val="left"/>
+      <w:pPr>
+        <w:tabs>
+          <w:tab w:val="num" w:pos="5040"/>
+        </w:tabs>
+        <w:ind w:left="5040" w:hanging="360"/>
+      </w:pPr>
+      <w:rPr>
+        <w:rFonts w:ascii="Wingdings" w:hAnsi="Wingdings" w:hint="default"/>
+        <w:sz w:val="20"/>
+      </w:rPr>
+    </w:lvl>
+    <w:lvl w:ilvl="7" w:tentative="1">
+      <w:start w:val="1"/>
+      <w:numFmt w:val="bullet"/>
+      <w:lvlText w:val=""/>
+      <w:lvlJc w:val="left"/>
+      <w:pPr>
+        <w:tabs>
+          <w:tab w:val="num" w:pos="5760"/>
+        </w:tabs>
+        <w:ind w:left="5760" w:hanging="360"/>
+      </w:pPr>
+      <w:rPr>
+        <w:rFonts w:ascii="Wingdings" w:hAnsi="Wingdings" w:hint="default"/>
+        <w:sz w:val="20"/>
+      </w:rPr>
+    </w:lvl>
+    <w:lvl w:ilvl="8" w:tentative="1">
+      <w:start w:val="1"/>
+      <w:numFmt w:val="bullet"/>
+      <w:lvlText w:val=""/>
+      <w:lvlJc w:val="left"/>
+      <w:pPr>
+        <w:tabs>
+          <w:tab w:val="num" w:pos="6480"/>
+        </w:tabs>
+        <w:ind w:left="6480" w:hanging="360"/>
+      </w:pPr>
+      <w:rPr>
+        <w:rFonts w:ascii="Wingdings" w:hAnsi="Wingdings" w:hint="default"/>
+        <w:sz w:val="20"/>
+      </w:rPr>
+    </w:lvl>
+  </w:abstractNum>
+  <w:abstractNum w:abstractNumId="2" w15:restartNumberingAfterBreak="0">
+    <w:nsid w:val="3D0A751A"/>
+    <w:multiLevelType w:val="multilevel"/>
+    <w:tmpl w:val="81EEE8F2"/>
+    <w:lvl w:ilvl="0">
+      <w:start w:val="1"/>
+      <w:numFmt w:val="bullet"/>
+      <w:lvlText w:val=""/>
+      <w:lvlJc w:val="left"/>
+      <w:pPr>
+        <w:tabs>
+          <w:tab w:val="num" w:pos="720"/>
+        </w:tabs>
+        <w:ind w:left="720" w:hanging="360"/>
+      </w:pPr>
+      <w:rPr>
+        <w:rFonts w:ascii="Symbol" w:hAnsi="Symbol" w:hint="default"/>
+        <w:sz w:val="20"/>
+      </w:rPr>
+    </w:lvl>
+    <w:lvl w:ilvl="1" w:tentative="1">
+      <w:start w:val="1"/>
+      <w:numFmt w:val="bullet"/>
+      <w:lvlText w:val="o"/>
+      <w:lvlJc w:val="left"/>
+      <w:pPr>
+        <w:tabs>
+          <w:tab w:val="num" w:pos="1440"/>
+        </w:tabs>
+        <w:ind w:left="1440" w:hanging="360"/>
+      </w:pPr>
+      <w:rPr>
+        <w:rFonts w:ascii="Courier New" w:hAnsi="Courier New" w:hint="default"/>
+        <w:sz w:val="20"/>
+      </w:rPr>
+    </w:lvl>
+    <w:lvl w:ilvl="2" w:tentative="1">
+      <w:start w:val="1"/>
+      <w:numFmt w:val="bullet"/>
+      <w:lvlText w:val=""/>
+      <w:lvlJc w:val="left"/>
+      <w:pPr>
+        <w:tabs>
+          <w:tab w:val="num" w:pos="2160"/>
+        </w:tabs>
+        <w:ind w:left="2160" w:hanging="360"/>
+      </w:pPr>
+      <w:rPr>
+        <w:rFonts w:ascii="Wingdings" w:hAnsi="Wingdings" w:hint="default"/>
+        <w:sz w:val="20"/>
+      </w:rPr>
+    </w:lvl>
+    <w:lvl w:ilvl="3" w:tentative="1">
+      <w:start w:val="1"/>
+      <w:numFmt w:val="bullet"/>
+      <w:lvlText w:val=""/>
+      <w:lvlJc w:val="left"/>
+      <w:pPr>
+        <w:tabs>
+          <w:tab w:val="num" w:pos="2880"/>
+        </w:tabs>
+        <w:ind w:left="2880" w:hanging="360"/>
+      </w:pPr>
+      <w:rPr>
+        <w:rFonts w:ascii="Wingdings" w:hAnsi="Wingdings" w:hint="default"/>
+        <w:sz w:val="20"/>
+      </w:rPr>
+    </w:lvl>
+    <w:lvl w:ilvl="4" w:tentative="1">
+      <w:start w:val="1"/>
+      <w:numFmt w:val="bullet"/>
+      <w:lvlText w:val=""/>
+      <w:lvlJc w:val="left"/>
+      <w:pPr>
+        <w:tabs>
+          <w:tab w:val="num" w:pos="3600"/>
+        </w:tabs>
+        <w:ind w:left="3600" w:hanging="360"/>
+      </w:pPr>
+      <w:rPr>
+        <w:rFonts w:ascii="Wingdings" w:hAnsi="Wingdings" w:hint="default"/>
+        <w:sz w:val="20"/>
+      </w:rPr>
+    </w:lvl>
+    <w:lvl w:ilvl="5" w:tentative="1">
+      <w:start w:val="1"/>
+      <w:numFmt w:val="bullet"/>
+      <w:lvlText w:val=""/>
+      <w:lvlJc w:val="left"/>
+      <w:pPr>
+        <w:tabs>
+          <w:tab w:val="num" w:pos="4320"/>
+        </w:tabs>
+        <w:ind w:left="4320" w:hanging="360"/>
+      </w:pPr>
+      <w:rPr>
+        <w:rFonts w:ascii="Wingdings" w:hAnsi="Wingdings" w:hint="default"/>
+        <w:sz w:val="20"/>
+      </w:rPr>
+    </w:lvl>
+    <w:lvl w:ilvl="6" w:tentative="1">
+      <w:start w:val="1"/>
+      <w:numFmt w:val="bullet"/>
+      <w:lvlText w:val=""/>
+      <w:lvlJc w:val="left"/>
+      <w:pPr>
+        <w:tabs>
+          <w:tab w:val="num" w:pos="5040"/>
+        </w:tabs>
+        <w:ind w:left="5040" w:hanging="360"/>
+      </w:pPr>
+      <w:rPr>
+        <w:rFonts w:ascii="Wingdings" w:hAnsi="Wingdings" w:hint="default"/>
+        <w:sz w:val="20"/>
+      </w:rPr>
+    </w:lvl>
+    <w:lvl w:ilvl="7" w:tentative="1">
+      <w:start w:val="1"/>
+      <w:numFmt w:val="bullet"/>
+      <w:lvlText w:val=""/>
+      <w:lvlJc w:val="left"/>
+      <w:pPr>
+        <w:tabs>
+          <w:tab w:val="num" w:pos="5760"/>
+        </w:tabs>
+        <w:ind w:left="5760" w:hanging="360"/>
+      </w:pPr>
+      <w:rPr>
+        <w:rFonts w:ascii="Wingdings" w:hAnsi="Wingdings" w:hint="default"/>
+        <w:sz w:val="20"/>
+      </w:rPr>
+    </w:lvl>
+    <w:lvl w:ilvl="8" w:tentative="1">
+      <w:start w:val="1"/>
+      <w:numFmt w:val="bullet"/>
+      <w:lvlText w:val=""/>
+      <w:lvlJc w:val="left"/>
+      <w:pPr>
+        <w:tabs>
+          <w:tab w:val="num" w:pos="6480"/>
+        </w:tabs>
+        <w:ind w:left="6480" w:hanging="360"/>
+      </w:pPr>
+      <w:rPr>
+        <w:rFonts w:ascii="Wingdings" w:hAnsi="Wingdings" w:hint="default"/>
+        <w:sz w:val="20"/>
+      </w:rPr>
+    </w:lvl>
+  </w:abstractNum>
+  <w:abstractNum w:abstractNumId="3" w15:restartNumberingAfterBreak="0">
+    <w:nsid w:val="3E7C520E"/>
+    <w:multiLevelType w:val="multilevel"/>
+    <w:tmpl w:val="362A3B22"/>
+    <w:lvl w:ilvl="0">
+      <w:start w:val="1"/>
+      <w:numFmt w:val="bullet"/>
+      <w:lvlText w:val=""/>
+      <w:lvlJc w:val="left"/>
+      <w:pPr>
+        <w:tabs>
+          <w:tab w:val="num" w:pos="720"/>
+        </w:tabs>
+        <w:ind w:left="720" w:hanging="360"/>
+      </w:pPr>
+      <w:rPr>
+        <w:rFonts w:ascii="Symbol" w:hAnsi="Symbol" w:hint="default"/>
+        <w:sz w:val="20"/>
+      </w:rPr>
+    </w:lvl>
+    <w:lvl w:ilvl="1" w:tentative="1">
+      <w:start w:val="1"/>
+      <w:numFmt w:val="bullet"/>
+      <w:lvlText w:val="o"/>
+      <w:lvlJc w:val="left"/>
+      <w:pPr>
+        <w:tabs>
+          <w:tab w:val="num" w:pos="1440"/>
+        </w:tabs>
+        <w:ind w:left="1440" w:hanging="360"/>
+      </w:pPr>
+      <w:rPr>
+        <w:rFonts w:ascii="Courier New" w:hAnsi="Courier New" w:hint="default"/>
+        <w:sz w:val="20"/>
+      </w:rPr>
+    </w:lvl>
+    <w:lvl w:ilvl="2" w:tentative="1">
+      <w:start w:val="1"/>
+      <w:numFmt w:val="bullet"/>
+      <w:lvlText w:val=""/>
+      <w:lvlJc w:val="left"/>
+      <w:pPr>
+        <w:tabs>
+          <w:tab w:val="num" w:pos="2160"/>
+        </w:tabs>
+        <w:ind w:left="2160" w:hanging="360"/>
+      </w:pPr>
+      <w:rPr>
+        <w:rFonts w:ascii="Wingdings" w:hAnsi="Wingdings" w:hint="default"/>
+        <w:sz w:val="20"/>
+      </w:rPr>
+    </w:lvl>
+    <w:lvl w:ilvl="3" w:tentative="1">
+      <w:start w:val="1"/>
+      <w:numFmt w:val="bullet"/>
+      <w:lvlText w:val=""/>
+      <w:lvlJc w:val="left"/>
+      <w:pPr>
+        <w:tabs>
+          <w:tab w:val="num" w:pos="2880"/>
+        </w:tabs>
+        <w:ind w:left="2880" w:hanging="360"/>
+      </w:pPr>
+      <w:rPr>
+        <w:rFonts w:ascii="Wingdings" w:hAnsi="Wingdings" w:hint="default"/>
+        <w:sz w:val="20"/>
+      </w:rPr>
+    </w:lvl>
+    <w:lvl w:ilvl="4" w:tentative="1">
+      <w:start w:val="1"/>
+      <w:numFmt w:val="bullet"/>
+      <w:lvlText w:val=""/>
+      <w:lvlJc w:val="left"/>
+      <w:pPr>
+        <w:tabs>
+          <w:tab w:val="num" w:pos="3600"/>
+        </w:tabs>
+        <w:ind w:left="3600" w:hanging="360"/>
+      </w:pPr>
+      <w:rPr>
+        <w:rFonts w:ascii="Wingdings" w:hAnsi="Wingdings" w:hint="default"/>
+        <w:sz w:val="20"/>
+      </w:rPr>
+    </w:lvl>
+    <w:lvl w:ilvl="5" w:tentative="1">
+      <w:start w:val="1"/>
+      <w:numFmt w:val="bullet"/>
+      <w:lvlText w:val=""/>
+      <w:lvlJc w:val="left"/>
+      <w:pPr>
+        <w:tabs>
+          <w:tab w:val="num" w:pos="4320"/>
+        </w:tabs>
+        <w:ind w:left="4320" w:hanging="360"/>
+      </w:pPr>
+      <w:rPr>
+        <w:rFonts w:ascii="Wingdings" w:hAnsi="Wingdings" w:hint="default"/>
+        <w:sz w:val="20"/>
+      </w:rPr>
+    </w:lvl>
+    <w:lvl w:ilvl="6" w:tentative="1">
+      <w:start w:val="1"/>
+      <w:numFmt w:val="bullet"/>
+      <w:lvlText w:val=""/>
+      <w:lvlJc w:val="left"/>
+      <w:pPr>
+        <w:tabs>
+          <w:tab w:val="num" w:pos="5040"/>
+        </w:tabs>
+        <w:ind w:left="5040" w:hanging="360"/>
+      </w:pPr>
+      <w:rPr>
+        <w:rFonts w:ascii="Wingdings" w:hAnsi="Wingdings" w:hint="default"/>
+        <w:sz w:val="20"/>
+      </w:rPr>
+    </w:lvl>
+    <w:lvl w:ilvl="7" w:tentative="1">
+      <w:start w:val="1"/>
+      <w:numFmt w:val="bullet"/>
+      <w:lvlText w:val=""/>
+      <w:lvlJc w:val="left"/>
+      <w:pPr>
+        <w:tabs>
+          <w:tab w:val="num" w:pos="5760"/>
+        </w:tabs>
+        <w:ind w:left="5760" w:hanging="360"/>
+      </w:pPr>
+      <w:rPr>
+        <w:rFonts w:ascii="Wingdings" w:hAnsi="Wingdings" w:hint="default"/>
+        <w:sz w:val="20"/>
+      </w:rPr>
+    </w:lvl>
+    <w:lvl w:ilvl="8" w:tentative="1">
+      <w:start w:val="1"/>
+      <w:numFmt w:val="bullet"/>
+      <w:lvlText w:val=""/>
+      <w:lvlJc w:val="left"/>
+      <w:pPr>
+        <w:tabs>
+          <w:tab w:val="num" w:pos="6480"/>
+        </w:tabs>
+        <w:ind w:left="6480" w:hanging="360"/>
+      </w:pPr>
+      <w:rPr>
+        <w:rFonts w:ascii="Wingdings" w:hAnsi="Wingdings" w:hint="default"/>
+        <w:sz w:val="20"/>
+      </w:rPr>
+    </w:lvl>
+  </w:abstractNum>
+  <w:abstractNum w:abstractNumId="4" w15:restartNumberingAfterBreak="0">
     <w:nsid w:val="4A6D7F10"/>
     <w:multiLevelType w:val="multilevel"/>
     <w:tmpl w:val="9F749A58"/>
@@ -770,7 +2646,7 @@
       </w:rPr>
     </w:lvl>
   </w:abstractNum>
-  <w:abstractNum w:abstractNumId="2" w15:restartNumberingAfterBreak="0">
+  <w:abstractNum w:abstractNumId="5" w15:restartNumberingAfterBreak="0">
     <w:nsid w:val="5A4D11E4"/>
     <w:multiLevelType w:val="multilevel"/>
     <w:tmpl w:val="FAEE4354"/>
@@ -919,7 +2795,156 @@
       </w:rPr>
     </w:lvl>
   </w:abstractNum>
-  <w:abstractNum w:abstractNumId="3" w15:restartNumberingAfterBreak="0">
+  <w:abstractNum w:abstractNumId="6" w15:restartNumberingAfterBreak="0">
+    <w:nsid w:val="5E5D6F30"/>
+    <w:multiLevelType w:val="multilevel"/>
+    <w:tmpl w:val="CCD460BA"/>
+    <w:lvl w:ilvl="0">
+      <w:start w:val="1"/>
+      <w:numFmt w:val="bullet"/>
+      <w:lvlText w:val=""/>
+      <w:lvlJc w:val="left"/>
+      <w:pPr>
+        <w:tabs>
+          <w:tab w:val="num" w:pos="720"/>
+        </w:tabs>
+        <w:ind w:left="720" w:hanging="360"/>
+      </w:pPr>
+      <w:rPr>
+        <w:rFonts w:ascii="Symbol" w:hAnsi="Symbol" w:hint="default"/>
+        <w:sz w:val="20"/>
+      </w:rPr>
+    </w:lvl>
+    <w:lvl w:ilvl="1">
+      <w:start w:val="1"/>
+      <w:numFmt w:val="bullet"/>
+      <w:lvlText w:val="o"/>
+      <w:lvlJc w:val="left"/>
+      <w:pPr>
+        <w:tabs>
+          <w:tab w:val="num" w:pos="1440"/>
+        </w:tabs>
+        <w:ind w:left="1440" w:hanging="360"/>
+      </w:pPr>
+      <w:rPr>
+        <w:rFonts w:ascii="Courier New" w:hAnsi="Courier New" w:hint="default"/>
+        <w:sz w:val="20"/>
+      </w:rPr>
+    </w:lvl>
+    <w:lvl w:ilvl="2" w:tentative="1">
+      <w:start w:val="1"/>
+      <w:numFmt w:val="bullet"/>
+      <w:lvlText w:val=""/>
+      <w:lvlJc w:val="left"/>
+      <w:pPr>
+        <w:tabs>
+          <w:tab w:val="num" w:pos="2160"/>
+        </w:tabs>
+        <w:ind w:left="2160" w:hanging="360"/>
+      </w:pPr>
+      <w:rPr>
+        <w:rFonts w:ascii="Wingdings" w:hAnsi="Wingdings" w:hint="default"/>
+        <w:sz w:val="20"/>
+      </w:rPr>
+    </w:lvl>
+    <w:lvl w:ilvl="3" w:tentative="1">
+      <w:start w:val="1"/>
+      <w:numFmt w:val="bullet"/>
+      <w:lvlText w:val=""/>
+      <w:lvlJc w:val="left"/>
+      <w:pPr>
+        <w:tabs>
+          <w:tab w:val="num" w:pos="2880"/>
+        </w:tabs>
+        <w:ind w:left="2880" w:hanging="360"/>
+      </w:pPr>
+      <w:rPr>
+        <w:rFonts w:ascii="Wingdings" w:hAnsi="Wingdings" w:hint="default"/>
+        <w:sz w:val="20"/>
+      </w:rPr>
+    </w:lvl>
+    <w:lvl w:ilvl="4" w:tentative="1">
+      <w:start w:val="1"/>
+      <w:numFmt w:val="bullet"/>
+      <w:lvlText w:val=""/>
+      <w:lvlJc w:val="left"/>
+      <w:pPr>
+        <w:tabs>
+          <w:tab w:val="num" w:pos="3600"/>
+        </w:tabs>
+        <w:ind w:left="3600" w:hanging="360"/>
+      </w:pPr>
+      <w:rPr>
+        <w:rFonts w:ascii="Wingdings" w:hAnsi="Wingdings" w:hint="default"/>
+        <w:sz w:val="20"/>
+      </w:rPr>
+    </w:lvl>
+    <w:lvl w:ilvl="5" w:tentative="1">
+      <w:start w:val="1"/>
+      <w:numFmt w:val="bullet"/>
+      <w:lvlText w:val=""/>
+      <w:lvlJc w:val="left"/>
+      <w:pPr>
+        <w:tabs>
+          <w:tab w:val="num" w:pos="4320"/>
+        </w:tabs>
+        <w:ind w:left="4320" w:hanging="360"/>
+      </w:pPr>
+      <w:rPr>
+        <w:rFonts w:ascii="Wingdings" w:hAnsi="Wingdings" w:hint="default"/>
+        <w:sz w:val="20"/>
+      </w:rPr>
+    </w:lvl>
+    <w:lvl w:ilvl="6" w:tentative="1">
+      <w:start w:val="1"/>
+      <w:numFmt w:val="bullet"/>
+      <w:lvlText w:val=""/>
+      <w:lvlJc w:val="left"/>
+      <w:pPr>
+        <w:tabs>
+          <w:tab w:val="num" w:pos="5040"/>
+        </w:tabs>
+        <w:ind w:left="5040" w:hanging="360"/>
+      </w:pPr>
+      <w:rPr>
+        <w:rFonts w:ascii="Wingdings" w:hAnsi="Wingdings" w:hint="default"/>
+        <w:sz w:val="20"/>
+      </w:rPr>
+    </w:lvl>
+    <w:lvl w:ilvl="7" w:tentative="1">
+      <w:start w:val="1"/>
+      <w:numFmt w:val="bullet"/>
+      <w:lvlText w:val=""/>
+      <w:lvlJc w:val="left"/>
+      <w:pPr>
+        <w:tabs>
+          <w:tab w:val="num" w:pos="5760"/>
+        </w:tabs>
+        <w:ind w:left="5760" w:hanging="360"/>
+      </w:pPr>
+      <w:rPr>
+        <w:rFonts w:ascii="Wingdings" w:hAnsi="Wingdings" w:hint="default"/>
+        <w:sz w:val="20"/>
+      </w:rPr>
+    </w:lvl>
+    <w:lvl w:ilvl="8" w:tentative="1">
+      <w:start w:val="1"/>
+      <w:numFmt w:val="bullet"/>
+      <w:lvlText w:val=""/>
+      <w:lvlJc w:val="left"/>
+      <w:pPr>
+        <w:tabs>
+          <w:tab w:val="num" w:pos="6480"/>
+        </w:tabs>
+        <w:ind w:left="6480" w:hanging="360"/>
+      </w:pPr>
+      <w:rPr>
+        <w:rFonts w:ascii="Wingdings" w:hAnsi="Wingdings" w:hint="default"/>
+        <w:sz w:val="20"/>
+      </w:rPr>
+    </w:lvl>
+  </w:abstractNum>
+  <w:abstractNum w:abstractNumId="7" w15:restartNumberingAfterBreak="0">
     <w:nsid w:val="63742612"/>
     <w:multiLevelType w:val="multilevel"/>
     <w:tmpl w:val="983494BE"/>
@@ -1068,7 +3093,7 @@
       </w:rPr>
     </w:lvl>
   </w:abstractNum>
-  <w:abstractNum w:abstractNumId="4" w15:restartNumberingAfterBreak="0">
+  <w:abstractNum w:abstractNumId="8" w15:restartNumberingAfterBreak="0">
     <w:nsid w:val="776A669C"/>
     <w:multiLevelType w:val="multilevel"/>
     <w:tmpl w:val="5970B5F8"/>
@@ -1221,15 +3246,27 @@
     <w:abstractNumId w:val="0"/>
   </w:num>
   <w:num w:numId="2" w16cid:durableId="1618440808">
+    <w:abstractNumId w:val="4"/>
+  </w:num>
+  <w:num w:numId="3" w16cid:durableId="1633711051">
+    <w:abstractNumId w:val="7"/>
+  </w:num>
+  <w:num w:numId="4" w16cid:durableId="736784016">
+    <w:abstractNumId w:val="8"/>
+  </w:num>
+  <w:num w:numId="5" w16cid:durableId="964123246">
+    <w:abstractNumId w:val="5"/>
+  </w:num>
+  <w:num w:numId="6" w16cid:durableId="595676046">
+    <w:abstractNumId w:val="6"/>
+  </w:num>
+  <w:num w:numId="7" w16cid:durableId="77410984">
+    <w:abstractNumId w:val="3"/>
+  </w:num>
+  <w:num w:numId="8" w16cid:durableId="1391999898">
     <w:abstractNumId w:val="1"/>
   </w:num>
-  <w:num w:numId="3" w16cid:durableId="1633711051">
-    <w:abstractNumId w:val="3"/>
-  </w:num>
-  <w:num w:numId="4" w16cid:durableId="736784016">
-    <w:abstractNumId w:val="4"/>
-  </w:num>
-  <w:num w:numId="5" w16cid:durableId="964123246">
+  <w:num w:numId="9" w16cid:durableId="229996940">
     <w:abstractNumId w:val="2"/>
   </w:num>
 </w:numbering>
@@ -1635,6 +3672,7 @@
   <w:style w:type="paragraph" w:default="1" w:styleId="Normal">
     <w:name w:val="Normal"/>
     <w:qFormat/>
+    <w:rsid w:val="0028348A"/>
   </w:style>
   <w:style w:type="paragraph" w:styleId="Ttulo1">
     <w:name w:val="heading 1"/>
@@ -1838,6 +3876,7 @@
   <w:style w:type="character" w:default="1" w:styleId="Fuentedeprrafopredeter">
     <w:name w:val="Default Paragraph Font"/>
     <w:uiPriority w:val="1"/>
+    <w:semiHidden/>
     <w:unhideWhenUsed/>
   </w:style>
   <w:style w:type="table" w:default="1" w:styleId="Tablanormal">

</xml_diff>